<commit_message>
Login , Logout , Register all api with email validation and ai model reading the captured image is done.
</commit_message>
<xml_diff>
--- a/Notes.docx
+++ b/Notes.docx
@@ -319,6 +319,9 @@
     </w:p>
     <w:p>
       <w:r>
+        <w:rPr>
+          <w:noProof/>
+        </w:rPr>
         <w:lastRenderedPageBreak/>
         <w:drawing>
           <wp:inline distT="0" distB="0" distL="0" distR="0" wp14:anchorId="30070168" wp14:editId="67BD2745">
@@ -357,6 +360,9 @@
         </w:drawing>
       </w:r>
       <w:r>
+        <w:rPr>
+          <w:noProof/>
+        </w:rPr>
         <w:drawing>
           <wp:inline distT="0" distB="0" distL="0" distR="0" wp14:anchorId="0B4260BC" wp14:editId="6B7376D5">
             <wp:extent cx="2872878" cy="1330036"/>
@@ -504,6 +510,618 @@
         <w:t xml:space="preserve"> → Request/Response models</w:t>
       </w:r>
     </w:p>
+    <w:p>
+      <w:pPr>
+        <w:rPr>
+          <w:b/>
+          <w:bCs/>
+        </w:rPr>
+      </w:pPr>
+      <w:proofErr w:type="gramStart"/>
+      <w:r>
+        <w:rPr>
+          <w:b/>
+          <w:bCs/>
+        </w:rPr>
+        <w:lastRenderedPageBreak/>
+        <w:t>DABATBASE :</w:t>
+      </w:r>
+      <w:proofErr w:type="gramEnd"/>
+      <w:r>
+        <w:rPr>
+          <w:b/>
+          <w:bCs/>
+        </w:rPr>
+        <w:br/>
+      </w:r>
+      <w:r>
+        <w:rPr>
+          <w:b/>
+          <w:bCs/>
+          <w:noProof/>
+        </w:rPr>
+        <w:drawing>
+          <wp:inline distT="0" distB="0" distL="0" distR="0" wp14:anchorId="05E26F8D" wp14:editId="6F577DFC">
+            <wp:extent cx="2328553" cy="3761509"/>
+            <wp:effectExtent l="0" t="0" r="0" b="0"/>
+            <wp:docPr id="2042499567" name="Picture 1"/>
+            <wp:cNvGraphicFramePr>
+              <a:graphicFrameLocks xmlns:a="http://schemas.openxmlformats.org/drawingml/2006/main" noChangeAspect="1"/>
+            </wp:cNvGraphicFramePr>
+            <a:graphic xmlns:a="http://schemas.openxmlformats.org/drawingml/2006/main">
+              <a:graphicData uri="http://schemas.openxmlformats.org/drawingml/2006/picture">
+                <pic:pic xmlns:pic="http://schemas.openxmlformats.org/drawingml/2006/picture">
+                  <pic:nvPicPr>
+                    <pic:cNvPr id="2042499567" name=""/>
+                    <pic:cNvPicPr/>
+                  </pic:nvPicPr>
+                  <pic:blipFill>
+                    <a:blip r:embed="rId7"/>
+                    <a:stretch>
+                      <a:fillRect/>
+                    </a:stretch>
+                  </pic:blipFill>
+                  <pic:spPr>
+                    <a:xfrm>
+                      <a:off x="0" y="0"/>
+                      <a:ext cx="2333120" cy="3768886"/>
+                    </a:xfrm>
+                    <a:prstGeom prst="rect">
+                      <a:avLst/>
+                    </a:prstGeom>
+                  </pic:spPr>
+                </pic:pic>
+              </a:graphicData>
+            </a:graphic>
+          </wp:inline>
+        </w:drawing>
+      </w:r>
+    </w:p>
+    <w:p>
+      <w:pPr>
+        <w:rPr>
+          <w:b/>
+          <w:bCs/>
+        </w:rPr>
+      </w:pPr>
+      <w:r>
+        <w:rPr>
+          <w:rFonts w:ascii="Segoe UI Emoji" w:hAnsi="Segoe UI Emoji" w:cs="Segoe UI Emoji"/>
+          <w:b/>
+          <w:bCs/>
+        </w:rPr>
+        <w:t>🧠</w:t>
+      </w:r>
+      <w:r>
+        <w:rPr>
+          <w:b/>
+          <w:bCs/>
+        </w:rPr>
+        <w:t xml:space="preserve"> WHY THIS SQL IS PROFESSIONAL</w:t>
+      </w:r>
+    </w:p>
+    <w:p>
+      <w:r>
+        <w:t>Let me explain briefly (important for interviews):</w:t>
+      </w:r>
+    </w:p>
+    <w:p>
+      <w:pPr>
+        <w:numPr>
+          <w:ilvl w:val="0"/>
+          <w:numId w:val="6"/>
+        </w:numPr>
+      </w:pPr>
+      <w:proofErr w:type="gramStart"/>
+      <w:r>
+        <w:t>IDENTITY(</w:t>
+      </w:r>
+      <w:proofErr w:type="gramEnd"/>
+      <w:r>
+        <w:t>1,1) → auto-increment primary key</w:t>
+      </w:r>
+    </w:p>
+    <w:p>
+      <w:pPr>
+        <w:numPr>
+          <w:ilvl w:val="0"/>
+          <w:numId w:val="6"/>
+        </w:numPr>
+      </w:pPr>
+      <w:r>
+        <w:t>NVARCHAR → supports Unicode (names, emails)</w:t>
+      </w:r>
+    </w:p>
+    <w:p>
+      <w:pPr>
+        <w:numPr>
+          <w:ilvl w:val="0"/>
+          <w:numId w:val="6"/>
+        </w:numPr>
+      </w:pPr>
+      <w:r>
+        <w:t>Email UNIQUE → prevents duplicate users</w:t>
+      </w:r>
+    </w:p>
+    <w:p>
+      <w:pPr>
+        <w:numPr>
+          <w:ilvl w:val="0"/>
+          <w:numId w:val="6"/>
+        </w:numPr>
+      </w:pPr>
+      <w:proofErr w:type="spellStart"/>
+      <w:r>
+        <w:t>FaceImagePath</w:t>
+      </w:r>
+      <w:proofErr w:type="spellEnd"/>
+      <w:r>
+        <w:t xml:space="preserve"> </w:t>
+      </w:r>
+      <w:proofErr w:type="gramStart"/>
+      <w:r>
+        <w:t>NVARCHAR(</w:t>
+      </w:r>
+      <w:proofErr w:type="gramEnd"/>
+      <w:r>
+        <w:t>300) → enough length for file paths or blob URLs</w:t>
+      </w:r>
+    </w:p>
+    <w:p>
+      <w:pPr>
+        <w:numPr>
+          <w:ilvl w:val="0"/>
+          <w:numId w:val="6"/>
+        </w:numPr>
+      </w:pPr>
+      <w:r>
+        <w:t xml:space="preserve">DATETIME2 + </w:t>
+      </w:r>
+      <w:proofErr w:type="gramStart"/>
+      <w:r>
+        <w:t>GETUTCDATE(</w:t>
+      </w:r>
+      <w:proofErr w:type="gramEnd"/>
+      <w:r>
+        <w:t>) → best practice for timestamps</w:t>
+      </w:r>
+    </w:p>
+    <w:p>
+      <w:r>
+        <w:rPr>
+          <w:rFonts w:ascii="Times New Roman" w:eastAsia="Times New Roman" w:hAnsi="Times New Roman" w:cs="Times New Roman"/>
+          <w:b/>
+          <w:bCs/>
+          <w:kern w:val="0"/>
+          <w:sz w:val="36"/>
+          <w:szCs w:val="36"/>
+          <w:lang w:eastAsia="en-IN"/>
+          <w14:ligatures w14:val="none"/>
+        </w:rPr>
+        <w:t>Create Vite React project</w:t>
+      </w:r>
+    </w:p>
+    <w:p>
+      <w:proofErr w:type="spellStart"/>
+      <w:r>
+        <w:t>npm</w:t>
+      </w:r>
+      <w:proofErr w:type="spellEnd"/>
+      <w:r>
+        <w:t xml:space="preserve"> create </w:t>
+      </w:r>
+      <w:proofErr w:type="spellStart"/>
+      <w:r>
+        <w:t>vite@latest</w:t>
+      </w:r>
+      <w:proofErr w:type="spellEnd"/>
+      <w:r>
+        <w:t xml:space="preserve"> </w:t>
+      </w:r>
+      <w:proofErr w:type="spellStart"/>
+      <w:r>
+        <w:t>FaceLockAuth.UI</w:t>
+      </w:r>
+      <w:proofErr w:type="spellEnd"/>
+    </w:p>
+    <w:p>
+      <w:r>
+        <w:t xml:space="preserve">cd </w:t>
+      </w:r>
+      <w:proofErr w:type="spellStart"/>
+      <w:r>
+        <w:t>FaceLockAuth.UI</w:t>
+      </w:r>
+      <w:proofErr w:type="spellEnd"/>
+    </w:p>
+    <w:p>
+      <w:proofErr w:type="spellStart"/>
+      <w:r>
+        <w:t>npm</w:t>
+      </w:r>
+      <w:proofErr w:type="spellEnd"/>
+      <w:r>
+        <w:t xml:space="preserve"> install</w:t>
+      </w:r>
+    </w:p>
+    <w:p>
+      <w:proofErr w:type="spellStart"/>
+      <w:r>
+        <w:t>npm</w:t>
+      </w:r>
+      <w:proofErr w:type="spellEnd"/>
+      <w:r>
+        <w:t xml:space="preserve"> run dev</w:t>
+      </w:r>
+    </w:p>
+    <w:p>
+      <w:hyperlink r:id="rId8" w:history="1">
+        <w:r>
+          <w:rPr>
+            <w:rStyle w:val="Hyperlink"/>
+          </w:rPr>
+          <w:t>http://localhost:5173</w:t>
+        </w:r>
+      </w:hyperlink>
+    </w:p>
+    <w:p>
+      <w:r>
+        <w:rPr>
+          <w:noProof/>
+        </w:rPr>
+        <w:lastRenderedPageBreak/>
+        <w:drawing>
+          <wp:inline distT="0" distB="0" distL="0" distR="0" wp14:anchorId="4A4AEC1E" wp14:editId="6A35216A">
+            <wp:extent cx="2854036" cy="2107368"/>
+            <wp:effectExtent l="0" t="0" r="3810" b="7620"/>
+            <wp:docPr id="1687942493" name="Picture 1"/>
+            <wp:cNvGraphicFramePr>
+              <a:graphicFrameLocks xmlns:a="http://schemas.openxmlformats.org/drawingml/2006/main" noChangeAspect="1"/>
+            </wp:cNvGraphicFramePr>
+            <a:graphic xmlns:a="http://schemas.openxmlformats.org/drawingml/2006/main">
+              <a:graphicData uri="http://schemas.openxmlformats.org/drawingml/2006/picture">
+                <pic:pic xmlns:pic="http://schemas.openxmlformats.org/drawingml/2006/picture">
+                  <pic:nvPicPr>
+                    <pic:cNvPr id="1687942493" name=""/>
+                    <pic:cNvPicPr/>
+                  </pic:nvPicPr>
+                  <pic:blipFill>
+                    <a:blip r:embed="rId9"/>
+                    <a:stretch>
+                      <a:fillRect/>
+                    </a:stretch>
+                  </pic:blipFill>
+                  <pic:spPr>
+                    <a:xfrm>
+                      <a:off x="0" y="0"/>
+                      <a:ext cx="2881804" cy="2127871"/>
+                    </a:xfrm>
+                    <a:prstGeom prst="rect">
+                      <a:avLst/>
+                    </a:prstGeom>
+                  </pic:spPr>
+                </pic:pic>
+              </a:graphicData>
+            </a:graphic>
+          </wp:inline>
+        </w:drawing>
+      </w:r>
+    </w:p>
+    <w:p>
+      <w:r>
+        <w:rPr>
+          <w:noProof/>
+        </w:rPr>
+        <w:drawing>
+          <wp:inline distT="0" distB="0" distL="0" distR="0" wp14:anchorId="3AB2062F" wp14:editId="14D8FB8F">
+            <wp:extent cx="1777740" cy="3616036"/>
+            <wp:effectExtent l="0" t="0" r="0" b="3810"/>
+            <wp:docPr id="1845244049" name="Picture 1"/>
+            <wp:cNvGraphicFramePr>
+              <a:graphicFrameLocks xmlns:a="http://schemas.openxmlformats.org/drawingml/2006/main" noChangeAspect="1"/>
+            </wp:cNvGraphicFramePr>
+            <a:graphic xmlns:a="http://schemas.openxmlformats.org/drawingml/2006/main">
+              <a:graphicData uri="http://schemas.openxmlformats.org/drawingml/2006/picture">
+                <pic:pic xmlns:pic="http://schemas.openxmlformats.org/drawingml/2006/picture">
+                  <pic:nvPicPr>
+                    <pic:cNvPr id="1845244049" name=""/>
+                    <pic:cNvPicPr/>
+                  </pic:nvPicPr>
+                  <pic:blipFill>
+                    <a:blip r:embed="rId10"/>
+                    <a:stretch>
+                      <a:fillRect/>
+                    </a:stretch>
+                  </pic:blipFill>
+                  <pic:spPr>
+                    <a:xfrm>
+                      <a:off x="0" y="0"/>
+                      <a:ext cx="1789386" cy="3639726"/>
+                    </a:xfrm>
+                    <a:prstGeom prst="rect">
+                      <a:avLst/>
+                    </a:prstGeom>
+                  </pic:spPr>
+                </pic:pic>
+              </a:graphicData>
+            </a:graphic>
+          </wp:inline>
+        </w:drawing>
+      </w:r>
+      <w:r>
+        <w:t xml:space="preserve"> </w:t>
+      </w:r>
+      <w:r>
+        <w:rPr>
+          <w:noProof/>
+        </w:rPr>
+        <w:drawing>
+          <wp:inline distT="0" distB="0" distL="0" distR="0" wp14:anchorId="1FEF03D1" wp14:editId="0CEAA455">
+            <wp:extent cx="1716941" cy="3622963"/>
+            <wp:effectExtent l="0" t="0" r="0" b="0"/>
+            <wp:docPr id="2079596129" name="Picture 1"/>
+            <wp:cNvGraphicFramePr>
+              <a:graphicFrameLocks xmlns:a="http://schemas.openxmlformats.org/drawingml/2006/main" noChangeAspect="1"/>
+            </wp:cNvGraphicFramePr>
+            <a:graphic xmlns:a="http://schemas.openxmlformats.org/drawingml/2006/main">
+              <a:graphicData uri="http://schemas.openxmlformats.org/drawingml/2006/picture">
+                <pic:pic xmlns:pic="http://schemas.openxmlformats.org/drawingml/2006/picture">
+                  <pic:nvPicPr>
+                    <pic:cNvPr id="2079596129" name=""/>
+                    <pic:cNvPicPr/>
+                  </pic:nvPicPr>
+                  <pic:blipFill>
+                    <a:blip r:embed="rId11"/>
+                    <a:stretch>
+                      <a:fillRect/>
+                    </a:stretch>
+                  </pic:blipFill>
+                  <pic:spPr>
+                    <a:xfrm>
+                      <a:off x="0" y="0"/>
+                      <a:ext cx="1732763" cy="3656349"/>
+                    </a:xfrm>
+                    <a:prstGeom prst="rect">
+                      <a:avLst/>
+                    </a:prstGeom>
+                  </pic:spPr>
+                </pic:pic>
+              </a:graphicData>
+            </a:graphic>
+          </wp:inline>
+        </w:drawing>
+      </w:r>
+      <w:r>
+        <w:rPr>
+          <w:noProof/>
+        </w:rPr>
+        <w:drawing>
+          <wp:inline distT="0" distB="0" distL="0" distR="0" wp14:anchorId="6BA2052E" wp14:editId="7F88CC63">
+            <wp:extent cx="1454727" cy="1034473"/>
+            <wp:effectExtent l="0" t="0" r="0" b="0"/>
+            <wp:docPr id="941963523" name="Picture 1"/>
+            <wp:cNvGraphicFramePr>
+              <a:graphicFrameLocks xmlns:a="http://schemas.openxmlformats.org/drawingml/2006/main" noChangeAspect="1"/>
+            </wp:cNvGraphicFramePr>
+            <a:graphic xmlns:a="http://schemas.openxmlformats.org/drawingml/2006/main">
+              <a:graphicData uri="http://schemas.openxmlformats.org/drawingml/2006/picture">
+                <pic:pic xmlns:pic="http://schemas.openxmlformats.org/drawingml/2006/picture">
+                  <pic:nvPicPr>
+                    <pic:cNvPr id="941963523" name=""/>
+                    <pic:cNvPicPr/>
+                  </pic:nvPicPr>
+                  <pic:blipFill>
+                    <a:blip r:embed="rId12"/>
+                    <a:stretch>
+                      <a:fillRect/>
+                    </a:stretch>
+                  </pic:blipFill>
+                  <pic:spPr>
+                    <a:xfrm>
+                      <a:off x="0" y="0"/>
+                      <a:ext cx="1461593" cy="1039355"/>
+                    </a:xfrm>
+                    <a:prstGeom prst="rect">
+                      <a:avLst/>
+                    </a:prstGeom>
+                  </pic:spPr>
+                </pic:pic>
+              </a:graphicData>
+            </a:graphic>
+          </wp:inline>
+        </w:drawing>
+      </w:r>
+    </w:p>
+    <w:p/>
+    <w:p>
+      <w:r>
+        <w:rPr>
+          <w:noProof/>
+        </w:rPr>
+        <w:drawing>
+          <wp:inline distT="0" distB="0" distL="0" distR="0" wp14:anchorId="7F057313" wp14:editId="073455D4">
+            <wp:extent cx="2708564" cy="1684893"/>
+            <wp:effectExtent l="0" t="0" r="0" b="0"/>
+            <wp:docPr id="93782463" name="Picture 1"/>
+            <wp:cNvGraphicFramePr>
+              <a:graphicFrameLocks xmlns:a="http://schemas.openxmlformats.org/drawingml/2006/main" noChangeAspect="1"/>
+            </wp:cNvGraphicFramePr>
+            <a:graphic xmlns:a="http://schemas.openxmlformats.org/drawingml/2006/main">
+              <a:graphicData uri="http://schemas.openxmlformats.org/drawingml/2006/picture">
+                <pic:pic xmlns:pic="http://schemas.openxmlformats.org/drawingml/2006/picture">
+                  <pic:nvPicPr>
+                    <pic:cNvPr id="93782463" name=""/>
+                    <pic:cNvPicPr/>
+                  </pic:nvPicPr>
+                  <pic:blipFill>
+                    <a:blip r:embed="rId13"/>
+                    <a:stretch>
+                      <a:fillRect/>
+                    </a:stretch>
+                  </pic:blipFill>
+                  <pic:spPr>
+                    <a:xfrm>
+                      <a:off x="0" y="0"/>
+                      <a:ext cx="2712366" cy="1687258"/>
+                    </a:xfrm>
+                    <a:prstGeom prst="rect">
+                      <a:avLst/>
+                    </a:prstGeom>
+                  </pic:spPr>
+                </pic:pic>
+              </a:graphicData>
+            </a:graphic>
+          </wp:inline>
+        </w:drawing>
+      </w:r>
+    </w:p>
+    <w:p/>
+    <w:p>
+      <w:proofErr w:type="spellStart"/>
+      <w:r>
+        <w:t>npm</w:t>
+      </w:r>
+      <w:proofErr w:type="spellEnd"/>
+      <w:r>
+        <w:t xml:space="preserve"> install -D </w:t>
+      </w:r>
+      <w:proofErr w:type="spellStart"/>
+      <w:r>
+        <w:t>tailwindcss</w:t>
+      </w:r>
+      <w:proofErr w:type="spellEnd"/>
+      <w:r>
+        <w:t xml:space="preserve"> </w:t>
+      </w:r>
+      <w:proofErr w:type="spellStart"/>
+      <w:r>
+        <w:t>postcss</w:t>
+      </w:r>
+      <w:proofErr w:type="spellEnd"/>
+      <w:r>
+        <w:t xml:space="preserve"> </w:t>
+      </w:r>
+      <w:proofErr w:type="spellStart"/>
+      <w:r>
+        <w:t>autoprefixer</w:t>
+      </w:r>
+      <w:proofErr w:type="spellEnd"/>
+    </w:p>
+    <w:p>
+      <w:proofErr w:type="spellStart"/>
+      <w:r>
+        <w:t>npm</w:t>
+      </w:r>
+      <w:proofErr w:type="spellEnd"/>
+      <w:r>
+        <w:t xml:space="preserve"> install react-webcam</w:t>
+      </w:r>
+      <w:r>
+        <w:t xml:space="preserve"> – for camera capture image</w:t>
+      </w:r>
+    </w:p>
+    <w:p>
+      <w:proofErr w:type="spellStart"/>
+      <w:r>
+        <w:lastRenderedPageBreak/>
+        <w:t>npm</w:t>
+      </w:r>
+      <w:proofErr w:type="spellEnd"/>
+      <w:r>
+        <w:t xml:space="preserve"> install bootstrap</w:t>
+      </w:r>
+    </w:p>
+    <w:p>
+      <w:proofErr w:type="spellStart"/>
+      <w:r>
+        <w:t>npm</w:t>
+      </w:r>
+      <w:proofErr w:type="spellEnd"/>
+      <w:r>
+        <w:t xml:space="preserve"> install </w:t>
+      </w:r>
+      <w:proofErr w:type="spellStart"/>
+      <w:r>
+        <w:t>axios</w:t>
+      </w:r>
+      <w:proofErr w:type="spellEnd"/>
+    </w:p>
+    <w:p>
+      <w:r>
+        <w:t xml:space="preserve">//run </w:t>
+      </w:r>
+      <w:proofErr w:type="spellStart"/>
+      <w:r>
+        <w:t>onec</w:t>
+      </w:r>
+      <w:proofErr w:type="spellEnd"/>
+      <w:r>
+        <w:t>:</w:t>
+      </w:r>
+      <w:r>
+        <w:t xml:space="preserve"> </w:t>
+      </w:r>
+      <w:proofErr w:type="spellStart"/>
+      <w:r>
+        <w:t>npm</w:t>
+      </w:r>
+      <w:proofErr w:type="spellEnd"/>
+      <w:r>
+        <w:t xml:space="preserve"> install react-router-</w:t>
+      </w:r>
+      <w:proofErr w:type="spellStart"/>
+      <w:r>
+        <w:t>dom</w:t>
+      </w:r>
+      <w:proofErr w:type="spellEnd"/>
+      <w:r>
+        <w:t xml:space="preserve"> react-webcam </w:t>
+      </w:r>
+      <w:proofErr w:type="spellStart"/>
+      <w:r>
+        <w:t>axios</w:t>
+      </w:r>
+      <w:proofErr w:type="spellEnd"/>
+      <w:r>
+        <w:t xml:space="preserve"> bootstrap</w:t>
+      </w:r>
+    </w:p>
+    <w:p>
+      <w:pPr>
+        <w:rPr>
+          <w:lang w:val="en-US"/>
+        </w:rPr>
+      </w:pPr>
+      <w:proofErr w:type="spellStart"/>
+      <w:r>
+        <w:t>npm</w:t>
+      </w:r>
+      <w:proofErr w:type="spellEnd"/>
+      <w:r>
+        <w:t xml:space="preserve"> install face-api.js</w:t>
+      </w:r>
+    </w:p>
+    <w:p>
+      <w:pPr>
+        <w:rPr>
+          <w:lang w:val="en-US"/>
+        </w:rPr>
+      </w:pPr>
+      <w:r>
+        <w:rPr>
+          <w:lang w:val="en-US"/>
+        </w:rPr>
+        <w:t>//</w:t>
+      </w:r>
+      <w:r>
+        <w:rPr>
+          <w:lang w:val="en-US"/>
+        </w:rPr>
+        <w:t>https://github.com/justadudewhohacks/face-api.js-models/tree/master/face_recognition</w:t>
+      </w:r>
+    </w:p>
+    <w:p/>
+    <w:p/>
     <w:p/>
     <w:sectPr>
       <w:pgSz w:w="11906" w:h="16838"/>
@@ -518,6 +1136,155 @@
 <file path=word/numbering.xml><?xml version="1.0" encoding="utf-8"?>
 <w:numbering xmlns:wpc="http://schemas.microsoft.com/office/word/2010/wordprocessingCanvas" xmlns:cx="http://schemas.microsoft.com/office/drawing/2014/chartex" xmlns:cx1="http://schemas.microsoft.com/office/drawing/2015/9/8/chartex" xmlns:cx2="http://schemas.microsoft.com/office/drawing/2015/10/21/chartex" xmlns:cx3="http://schemas.microsoft.com/office/drawing/2016/5/9/chartex" xmlns:cx4="http://schemas.microsoft.com/office/drawing/2016/5/10/chartex" xmlns:cx5="http://schemas.microsoft.com/office/drawing/2016/5/11/chartex" xmlns:cx6="http://schemas.microsoft.com/office/drawing/2016/5/12/chartex" xmlns:cx7="http://schemas.microsoft.com/office/drawing/2016/5/13/chartex" xmlns:cx8="http://schemas.microsoft.com/office/drawing/2016/5/14/chartex" xmlns:mc="http://schemas.openxmlformats.org/markup-compatibility/2006" xmlns:aink="http://schemas.microsoft.com/office/drawing/2016/ink" xmlns:am3d="http://schemas.microsoft.com/office/drawing/2017/model3d" xmlns:o="urn:schemas-microsoft-com:office:office" xmlns:oel="http://schemas.microsoft.com/office/2019/extlst" xmlns:r="http://schemas.openxmlformats.org/officeDocument/2006/relationships" xmlns:m="http://schemas.openxmlformats.org/officeDocument/2006/math" xmlns:v="urn:schemas-microsoft-com:vml" xmlns:wp14="http://schemas.microsoft.com/office/word/2010/wordprocessingDrawing" xmlns:wp="http://schemas.openxmlformats.org/drawingml/2006/wordprocessingDrawing" xmlns:w10="urn:schemas-microsoft-com:office:word" xmlns:w="http://schemas.openxmlformats.org/wordprocessingml/2006/main" xmlns:w14="http://schemas.microsoft.com/office/word/2010/wordml" xmlns:w15="http://schemas.microsoft.com/office/word/2012/wordml" xmlns:w16cex="http://schemas.microsoft.com/office/word/2018/wordml/cex" xmlns:w16cid="http://schemas.microsoft.com/office/word/2016/wordml/cid" xmlns:w16="http://schemas.microsoft.com/office/word/2018/wordml" xmlns:w16du="http://schemas.microsoft.com/office/word/2023/wordml/word16du" xmlns:w16sdtdh="http://schemas.microsoft.com/office/word/2020/wordml/sdtdatahash" xmlns:w16sdtfl="http://schemas.microsoft.com/office/word/2024/wordml/sdtformatlock" xmlns:w16se="http://schemas.microsoft.com/office/word/2015/wordml/symex" xmlns:wpg="http://schemas.microsoft.com/office/word/2010/wordprocessingGroup" xmlns:wpi="http://schemas.microsoft.com/office/word/2010/wordprocessingInk" xmlns:wne="http://schemas.microsoft.com/office/word/2006/wordml" xmlns:wps="http://schemas.microsoft.com/office/word/2010/wordprocessingShape" mc:Ignorable="w14 w15 w16se w16cid w16 w16cex w16sdtdh w16sdtfl w16du wp14">
   <w:abstractNum w:abstractNumId="0" w15:restartNumberingAfterBreak="0">
+    <w:nsid w:val="26C74A58"/>
+    <w:multiLevelType w:val="multilevel"/>
+    <w:tmpl w:val="D3480C04"/>
+    <w:lvl w:ilvl="0">
+      <w:start w:val="1"/>
+      <w:numFmt w:val="bullet"/>
+      <w:lvlText w:val=""/>
+      <w:lvlJc w:val="left"/>
+      <w:pPr>
+        <w:tabs>
+          <w:tab w:val="num" w:pos="720"/>
+        </w:tabs>
+        <w:ind w:left="720" w:hanging="360"/>
+      </w:pPr>
+      <w:rPr>
+        <w:rFonts w:ascii="Symbol" w:hAnsi="Symbol" w:hint="default"/>
+        <w:sz w:val="20"/>
+      </w:rPr>
+    </w:lvl>
+    <w:lvl w:ilvl="1" w:tentative="1">
+      <w:start w:val="1"/>
+      <w:numFmt w:val="bullet"/>
+      <w:lvlText w:val="o"/>
+      <w:lvlJc w:val="left"/>
+      <w:pPr>
+        <w:tabs>
+          <w:tab w:val="num" w:pos="1440"/>
+        </w:tabs>
+        <w:ind w:left="1440" w:hanging="360"/>
+      </w:pPr>
+      <w:rPr>
+        <w:rFonts w:ascii="Courier New" w:hAnsi="Courier New" w:hint="default"/>
+        <w:sz w:val="20"/>
+      </w:rPr>
+    </w:lvl>
+    <w:lvl w:ilvl="2" w:tentative="1">
+      <w:start w:val="1"/>
+      <w:numFmt w:val="bullet"/>
+      <w:lvlText w:val=""/>
+      <w:lvlJc w:val="left"/>
+      <w:pPr>
+        <w:tabs>
+          <w:tab w:val="num" w:pos="2160"/>
+        </w:tabs>
+        <w:ind w:left="2160" w:hanging="360"/>
+      </w:pPr>
+      <w:rPr>
+        <w:rFonts w:ascii="Wingdings" w:hAnsi="Wingdings" w:hint="default"/>
+        <w:sz w:val="20"/>
+      </w:rPr>
+    </w:lvl>
+    <w:lvl w:ilvl="3" w:tentative="1">
+      <w:start w:val="1"/>
+      <w:numFmt w:val="bullet"/>
+      <w:lvlText w:val=""/>
+      <w:lvlJc w:val="left"/>
+      <w:pPr>
+        <w:tabs>
+          <w:tab w:val="num" w:pos="2880"/>
+        </w:tabs>
+        <w:ind w:left="2880" w:hanging="360"/>
+      </w:pPr>
+      <w:rPr>
+        <w:rFonts w:ascii="Wingdings" w:hAnsi="Wingdings" w:hint="default"/>
+        <w:sz w:val="20"/>
+      </w:rPr>
+    </w:lvl>
+    <w:lvl w:ilvl="4" w:tentative="1">
+      <w:start w:val="1"/>
+      <w:numFmt w:val="bullet"/>
+      <w:lvlText w:val=""/>
+      <w:lvlJc w:val="left"/>
+      <w:pPr>
+        <w:tabs>
+          <w:tab w:val="num" w:pos="3600"/>
+        </w:tabs>
+        <w:ind w:left="3600" w:hanging="360"/>
+      </w:pPr>
+      <w:rPr>
+        <w:rFonts w:ascii="Wingdings" w:hAnsi="Wingdings" w:hint="default"/>
+        <w:sz w:val="20"/>
+      </w:rPr>
+    </w:lvl>
+    <w:lvl w:ilvl="5" w:tentative="1">
+      <w:start w:val="1"/>
+      <w:numFmt w:val="bullet"/>
+      <w:lvlText w:val=""/>
+      <w:lvlJc w:val="left"/>
+      <w:pPr>
+        <w:tabs>
+          <w:tab w:val="num" w:pos="4320"/>
+        </w:tabs>
+        <w:ind w:left="4320" w:hanging="360"/>
+      </w:pPr>
+      <w:rPr>
+        <w:rFonts w:ascii="Wingdings" w:hAnsi="Wingdings" w:hint="default"/>
+        <w:sz w:val="20"/>
+      </w:rPr>
+    </w:lvl>
+    <w:lvl w:ilvl="6" w:tentative="1">
+      <w:start w:val="1"/>
+      <w:numFmt w:val="bullet"/>
+      <w:lvlText w:val=""/>
+      <w:lvlJc w:val="left"/>
+      <w:pPr>
+        <w:tabs>
+          <w:tab w:val="num" w:pos="5040"/>
+        </w:tabs>
+        <w:ind w:left="5040" w:hanging="360"/>
+      </w:pPr>
+      <w:rPr>
+        <w:rFonts w:ascii="Wingdings" w:hAnsi="Wingdings" w:hint="default"/>
+        <w:sz w:val="20"/>
+      </w:rPr>
+    </w:lvl>
+    <w:lvl w:ilvl="7" w:tentative="1">
+      <w:start w:val="1"/>
+      <w:numFmt w:val="bullet"/>
+      <w:lvlText w:val=""/>
+      <w:lvlJc w:val="left"/>
+      <w:pPr>
+        <w:tabs>
+          <w:tab w:val="num" w:pos="5760"/>
+        </w:tabs>
+        <w:ind w:left="5760" w:hanging="360"/>
+      </w:pPr>
+      <w:rPr>
+        <w:rFonts w:ascii="Wingdings" w:hAnsi="Wingdings" w:hint="default"/>
+        <w:sz w:val="20"/>
+      </w:rPr>
+    </w:lvl>
+    <w:lvl w:ilvl="8" w:tentative="1">
+      <w:start w:val="1"/>
+      <w:numFmt w:val="bullet"/>
+      <w:lvlText w:val=""/>
+      <w:lvlJc w:val="left"/>
+      <w:pPr>
+        <w:tabs>
+          <w:tab w:val="num" w:pos="6480"/>
+        </w:tabs>
+        <w:ind w:left="6480" w:hanging="360"/>
+      </w:pPr>
+      <w:rPr>
+        <w:rFonts w:ascii="Wingdings" w:hAnsi="Wingdings" w:hint="default"/>
+        <w:sz w:val="20"/>
+      </w:rPr>
+    </w:lvl>
+  </w:abstractNum>
+  <w:abstractNum w:abstractNumId="1" w15:restartNumberingAfterBreak="0">
     <w:nsid w:val="2CD24088"/>
     <w:multiLevelType w:val="multilevel"/>
     <w:tmpl w:val="D76A95A6"/>
@@ -666,7 +1433,7 @@
       </w:rPr>
     </w:lvl>
   </w:abstractNum>
-  <w:abstractNum w:abstractNumId="1" w15:restartNumberingAfterBreak="0">
+  <w:abstractNum w:abstractNumId="2" w15:restartNumberingAfterBreak="0">
     <w:nsid w:val="33B450E1"/>
     <w:multiLevelType w:val="multilevel"/>
     <w:tmpl w:val="19621674"/>
@@ -815,7 +1582,7 @@
       </w:rPr>
     </w:lvl>
   </w:abstractNum>
-  <w:abstractNum w:abstractNumId="2" w15:restartNumberingAfterBreak="0">
+  <w:abstractNum w:abstractNumId="3" w15:restartNumberingAfterBreak="0">
     <w:nsid w:val="426855FC"/>
     <w:multiLevelType w:val="multilevel"/>
     <w:tmpl w:val="E41E10F6"/>
@@ -928,7 +1695,7 @@
       </w:pPr>
     </w:lvl>
   </w:abstractNum>
-  <w:abstractNum w:abstractNumId="3" w15:restartNumberingAfterBreak="0">
+  <w:abstractNum w:abstractNumId="4" w15:restartNumberingAfterBreak="0">
     <w:nsid w:val="42D51B50"/>
     <w:multiLevelType w:val="multilevel"/>
     <w:tmpl w:val="F66AEC48"/>
@@ -1077,7 +1844,7 @@
       </w:rPr>
     </w:lvl>
   </w:abstractNum>
-  <w:abstractNum w:abstractNumId="4" w15:restartNumberingAfterBreak="0">
+  <w:abstractNum w:abstractNumId="5" w15:restartNumberingAfterBreak="0">
     <w:nsid w:val="47BA7FB7"/>
     <w:multiLevelType w:val="multilevel"/>
     <w:tmpl w:val="CF3A6F80"/>
@@ -1227,18 +1994,21 @@
     </w:lvl>
   </w:abstractNum>
   <w:num w:numId="1" w16cid:durableId="1332290675">
+    <w:abstractNumId w:val="2"/>
+  </w:num>
+  <w:num w:numId="2" w16cid:durableId="2083024479">
+    <w:abstractNumId w:val="3"/>
+  </w:num>
+  <w:num w:numId="3" w16cid:durableId="523056172">
+    <w:abstractNumId w:val="4"/>
+  </w:num>
+  <w:num w:numId="4" w16cid:durableId="151795262">
+    <w:abstractNumId w:val="5"/>
+  </w:num>
+  <w:num w:numId="5" w16cid:durableId="878590747">
     <w:abstractNumId w:val="1"/>
   </w:num>
-  <w:num w:numId="2" w16cid:durableId="2083024479">
-    <w:abstractNumId w:val="2"/>
-  </w:num>
-  <w:num w:numId="3" w16cid:durableId="523056172">
-    <w:abstractNumId w:val="3"/>
-  </w:num>
-  <w:num w:numId="4" w16cid:durableId="151795262">
-    <w:abstractNumId w:val="4"/>
-  </w:num>
-  <w:num w:numId="5" w16cid:durableId="878590747">
+  <w:num w:numId="6" w16cid:durableId="687098435">
     <w:abstractNumId w:val="0"/>
   </w:num>
 </w:numbering>
@@ -1672,7 +2442,6 @@
     <w:next w:val="Normal"/>
     <w:link w:val="Heading2Char"/>
     <w:uiPriority w:val="9"/>
-    <w:semiHidden/>
     <w:unhideWhenUsed/>
     <w:qFormat/>
     <w:rsid w:val="005A4705"/>
@@ -1847,6 +2616,7 @@
   <w:style w:type="character" w:default="1" w:styleId="DefaultParagraphFont">
     <w:name w:val="Default Paragraph Font"/>
     <w:uiPriority w:val="1"/>
+    <w:semiHidden/>
     <w:unhideWhenUsed/>
   </w:style>
   <w:style w:type="table" w:default="1" w:styleId="TableNormal">
@@ -1888,7 +2658,6 @@
     <w:basedOn w:val="DefaultParagraphFont"/>
     <w:link w:val="Heading2"/>
     <w:uiPriority w:val="9"/>
-    <w:semiHidden/>
     <w:rsid w:val="005A4705"/>
     <w:rPr>
       <w:rFonts w:asciiTheme="majorHAnsi" w:eastAsiaTheme="majorEastAsia" w:hAnsiTheme="majorHAnsi" w:cstheme="majorBidi"/>
@@ -2158,6 +2927,48 @@
       <w:smallCaps/>
       <w:color w:val="0F4761" w:themeColor="accent1" w:themeShade="BF"/>
       <w:spacing w:val="5"/>
+    </w:rPr>
+  </w:style>
+  <w:style w:type="paragraph" w:styleId="NormalWeb">
+    <w:name w:val="Normal (Web)"/>
+    <w:basedOn w:val="Normal"/>
+    <w:uiPriority w:val="99"/>
+    <w:semiHidden/>
+    <w:unhideWhenUsed/>
+    <w:rsid w:val="00B875B1"/>
+    <w:pPr>
+      <w:spacing w:before="100" w:beforeAutospacing="1" w:after="100" w:afterAutospacing="1" w:line="240" w:lineRule="auto"/>
+    </w:pPr>
+    <w:rPr>
+      <w:rFonts w:ascii="Times New Roman" w:eastAsia="Times New Roman" w:hAnsi="Times New Roman" w:cs="Times New Roman"/>
+      <w:kern w:val="0"/>
+      <w:sz w:val="24"/>
+      <w:szCs w:val="24"/>
+      <w:lang w:eastAsia="en-IN"/>
+      <w14:ligatures w14:val="none"/>
+    </w:rPr>
+  </w:style>
+  <w:style w:type="character" w:styleId="Hyperlink">
+    <w:name w:val="Hyperlink"/>
+    <w:basedOn w:val="DefaultParagraphFont"/>
+    <w:uiPriority w:val="99"/>
+    <w:unhideWhenUsed/>
+    <w:rsid w:val="00B875B1"/>
+    <w:rPr>
+      <w:color w:val="467886" w:themeColor="hyperlink"/>
+      <w:u w:val="single"/>
+    </w:rPr>
+  </w:style>
+  <w:style w:type="character" w:styleId="UnresolvedMention">
+    <w:name w:val="Unresolved Mention"/>
+    <w:basedOn w:val="DefaultParagraphFont"/>
+    <w:uiPriority w:val="99"/>
+    <w:semiHidden/>
+    <w:unhideWhenUsed/>
+    <w:rsid w:val="00B875B1"/>
+    <w:rPr>
+      <w:color w:val="605E5C"/>
+      <w:shd w:val="clear" w:color="auto" w:fill="E1DFDD"/>
     </w:rPr>
   </w:style>
 </w:styles>

</xml_diff>